<commit_message>
feat(profiles, startup): filter adult content and launch a chosen channel
- apply profile-aware adult filtering to provider and TMDB content
- hide adult content, Guide access and restricted playback in Kids mode
- preserve the complete catalogue and TMDB results for normal profiles
- add a searchable, profile-specific Live TV startup channel
- start immediately for one unlocked profile while respecting profile and PIN gates
- resolve saved channels safely and include startup targets in backup and restore
- fall back to Home when a startup channel is unavailable or restricted
- document the behavior and provider-category detection limitations
- verify focused tests, player tests, i18n checks, debug/release builds and device playback

No Room database migration required.
</commit_message>
<xml_diff>
--- a/extras/OwnTV_Master_Product_Brief.docx
+++ b/extras/OwnTV_Master_Product_Brief.docx
@@ -1481,7 +1481,7 @@
           <w:rFonts w:ascii="Cambria" w:hAnsi="Cambria"/>
           <w:sz w:val="22"/>
         </w:rPr>
-        <w:t>Per-profile startup setting: Home, last channel, or Live TV on Favorites</w:t>
+        <w:t>Per-profile startup setting: Home, last channel, Live TV on Favorites, or a searchable Specific channel picker. A single unlocked profile can auto-play immediately; multiple or PIN-locked profiles wait for selection/authentication. Startup channels resolve by provider remote ID, then name, then local row ID; hidden, Kids-restricted, disconnected or missing channels fall back safely to Home.</w:t>
       </w:r>
     </w:p>
     <w:p>
@@ -1930,7 +1930,7 @@
           <w:rFonts w:ascii="Cambria" w:hAnsi="Cambria"/>
           <w:sz w:val="22"/>
         </w:rPr>
-        <w:t>Kids flag</w:t>
+        <w:t>Kids flag hides adult provider categories/items across Live, Movies, Series, Home, Search, Guide, Catch-up, Downloads, custom categories, launcher recommendations and direct playback; the Guide itself is hidden. TMDB adult results are excluded only for Kids profiles. Detection uses multilingual category-name markers such as 18+ and XXX, with an Adult Swim exception; uncategorized or misleading provider content cannot be classified reliably.</w:t>
       </w:r>
     </w:p>
     <w:p>
@@ -2417,7 +2417,7 @@
         <w:pStyle w:val="ListBullet"/>
       </w:pPr>
       <w:r>
-        <w:t>One file covers profiles, sources, customizations, favorites, watch history, resume positions, and app settings, including each profile's Home row order/visibility. Generated Trending snapshots and fetched TMDB metadata are excluded and rebuilt after sync.</w:t>
+        <w:t>One file covers profiles, sources, customizations, favorites, watch history, resume positions, and app settings, including each profile's Home row order/visibility and Specific channel startup target. Generated Trending snapshots and fetched TMDB metadata are excluded and rebuilt after sync.</w:t>
       </w:r>
     </w:p>
     <w:p>

</xml_diff>

<commit_message>
feat(settings): add configurable remote shortcuts
- replace the fixed CH+/RW and CH-/FF paging page with a dedicated
  Remote Shortcuts screen
- support independent short- and long-press assignments for navigation,
  browsing, Now Playing, playback modes, and contextual player controls
- protect essential navigation keys and preserve fullscreen numeric
  channel entry and long-press Back behavior
- retain the original paging assignments and adjustable skip counts as
  defaults
- add physical-button icons, short/long badges, colored keycaps, and
  dedicated first/last paging illustrations
- persist shortcut assignments through Backup & Restore
- keep shortcut handling from intercepting D-pad navigation in browsing
  screens and the fullscreen player
- fix the Audio Mode top-bar progress line layout
- add complete translations, tests, changelog entries, README coverage,
  user-guide instructions, and product-brief documentation
</commit_message>
<xml_diff>
--- a/extras/OwnTV_Master_Product_Brief.docx
+++ b/extras/OwnTV_Master_Product_Brief.docx
@@ -1339,7 +1339,7 @@
         <w:pStyle w:val="ListBullet"/>
       </w:pPr>
       <w:r>
-        <w:t>Customize per profile: focus a category name to open its paged item list; hide, rename and reorder categories or individual channels, movies and series; recover hidden items; filter either level to All, Visible or Hidden; page both levels with CH+/Rewind and CH−/Fast-forward; and optionally protect the screen with a PIN.</w:t>
+        <w:t>Customize per profile: focus a category name to open its paged item list; hide, rename and reorder categories or individual channels, movies and series; recover hidden items; filter either level to All, Visible or Hidden; page both levels with configurable Remote Shortcut actions (shipped default: CH+/Rewind toward first, CH−/Fast-forward toward last); and optionally protect the screen with a PIN.</w:t>
       </w:r>
     </w:p>
     <w:p>
@@ -2356,6 +2356,14 @@
       </w:pPr>
       <w:r>
         <w:t>Per-source Auto Refresh — each playlist and each EPG source can refresh at startup or on a staleness interval (off by default).</w:t>
+      </w:r>
+    </w:p>
+    <w:p>
+      <w:pPr>
+        <w:pStyle w:val="ListBullet"/>
+      </w:pPr>
+      <w:r>
+        <w:t>Remote Shortcuts replaces the fixed CH+/RW · CH−/FF paging page: short and long presses of spare colour, number, channel and media keys can be assigned independently to 25 navigation, browsing and playback actions. The shipped paging assignments and per-direction skip counts remain the default; essential navigation keys and long-press Back are protected, fullscreen number entry keeps channel priority, and assignments persist through Backup &amp; Restore. Physical-key icons, localized short/long badges and coloured keycaps make the list readable across different remotes.</w:t>
       </w:r>
     </w:p>
     <w:p>

</xml_diff>

<commit_message>
fix: stabilize Guide position, trailers, and settings backups
- keep the Guide timeline centered when entering a programme row
- reduce embedded trailer UI and WebView processing overhead
- back up global player choices, Quick arrangement, and content-menu orders
- document the fixes across the changelog, user guide, README, and product brief
- mark v4.2.3 as released on 2026-08-26
</commit_message>
<xml_diff>
--- a/extras/OwnTV_Master_Product_Brief.docx
+++ b/extras/OwnTV_Master_Product_Brief.docx
@@ -1018,7 +1018,7 @@
         <w:pStyle w:val="ListBullet"/>
       </w:pPr>
       <w:r>
-        <w:t>The Lora-styled showcase shows global TMDB rank/type, rating, provider match, language fallback, advertised quality/HDR/audio signals, and provider season count. Actions reuse the established Play/Open Episodes, Trailer, full TMDB Details (plot/cast/genres), and All Versions search flows.</w:t>
+        <w:t>The Lora-styled showcase shows global TMDB rank/type, rating, provider match, language fallback, advertised quality/HDR/audio signals, and provider season count. Actions reuse the established Play/Open Episodes, Trailer, full TMDB Details (plot/cast/genres), and All Versions search flows. Trailers stay full screen inside OwnTV; the embedded YouTube surface disables its extra controls, captions, annotations and related-video UI, while OwnTV throttles progress updates to once per second for smoother playback on lower-memory TVs.</w:t>
       </w:r>
     </w:p>
     <w:p>
@@ -1553,7 +1553,7 @@
           <w:rFonts w:ascii="Cambria" w:hAnsi="Cambria"/>
           <w:sz w:val="22"/>
         </w:rPr>
-        <w:t>Full time × channel guide grid (XMLTV), opened with the current time around 37.5% across the timeline and two recent hours loaded immediately. The amber NOW badge and fading row marker refresh every 30 seconds without reopening Guide.</w:t>
+        <w:t>Full time × channel guide grid (XMLTV), opened with the current time around 37.5% across the timeline and two recent hours loaded immediately. The amber NOW badge and fading row marker refresh every 30 seconds without reopening Guide. Entering a programme row preserves that timeline position and scrolls only when the highlighted programme reaches a viewport edge.</w:t>
       </w:r>
     </w:p>
     <w:p>
@@ -2561,7 +2561,7 @@
         <w:pStyle w:val="ListBullet"/>
       </w:pPr>
       <w:r>
-        <w:t>One file covers profiles, sources, customizations, favorites, watch history, resume positions, and app settings, including each profile's Home row order/visibility and Specific channel startup target. Generated Trending snapshots and fetched TMDB metadata are excluded and rebuilt after sync.</w:t>
+        <w:t>One file covers profiles, sources, customizations, favorites, watch history, resume positions, and app settings, including each profile's Home row order/visibility and Specific channel startup target, both global player choices, Quick pinned rows/order, and all four long-press menu arrangements. Generated Trending snapshots and fetched TMDB metadata are excluded and rebuilt after sync.</w:t>
       </w:r>
     </w:p>
     <w:p>

</xml_diff>

<commit_message>
fix(settings, player): restore saved menus and stable Home resume audio
- wait for the stored long-press menu order before initializing the editor
- start resumed ExoPlayer VOD at the saved position during initial preparation
- prevent Home resume from falsely triggering Auto surround fallback
- document the fixes for v4.2.4 Unreleased
</commit_message>
<xml_diff>
--- a/extras/OwnTV_Master_Product_Brief.docx
+++ b/extras/OwnTV_Master_Product_Brief.docx
@@ -424,7 +424,7 @@
           <w:rFonts w:ascii="Cambria" w:hAnsi="Cambria"/>
           <w:sz w:val="22"/>
         </w:rPr>
-        <w:t>Surround sound — three modes (Auto / Stereo only / Surround) applied uniformly to BOTH engines. Surround decodes Dolby (AC-3/E-AC-3) and DTS to multichannel, Stereo only pins the audio sink to plain stereo PCM with no passthrough, Auto starts multichannel and self-demotes. A shared, non-disableable audio-output watchdog (silence, sink error, repeated underruns) latches the whole session to stereo across every engine when the sink accepts a format it cannot actually play. On movies and episodes playing in ExoPlayer, that recovery releases the old decoder, recreates the video surface, and resumes at the same position in ExoPlayer instead of mistaking the audio change for a video failure and switching to mpv.</w:t>
+        <w:t>Surround sound — three modes (Auto / Stereo only / Surround) applied uniformly to BOTH engines. Surround decodes Dolby (AC-3/E-AC-3) and DTS to multichannel, Stereo only pins the audio sink to plain stereo PCM with no passthrough, Auto starts multichannel and self-demotes. A shared, non-disableable audio-output watchdog (silence, sink error, repeated underruns) latches the whole session to stereo across every engine when the sink accepts a format it cannot actually play. On movies and episodes playing in ExoPlayer, that recovery releases the old decoder, recreates the video surface, and resumes at the same position in ExoPlayer instead of mistaking the audio change for a video failure and switching to mpv. A saved-position Home launch is supplied to ExoPlayer before its first prepare, preventing an immediate seek from tearing down a working E-AC3 output and falsely triggering the Auto stereo/mpv fallback on TCL/Realtek TVs.</w:t>
       </w:r>
     </w:p>
     <w:p>
@@ -1371,7 +1371,7 @@
         <w:pStyle w:val="ListBullet"/>
       </w:pPr>
       <w:r>
-        <w:t>The order of those context menus is user-arrangeable: Settings → Layout → Long-press menus lets each of the four menus (channel, movie, series, episode) be reordered by holding OK on an action and moving it, saved per menu and merge-tolerant across updates.</w:t>
+        <w:t>The order of those context menus is user-arrangeable: Settings → Layout → Long-press menus lets each of the four menus (channel, movie, series, episode) be reordered by holding OK on an action and moving it, saved per menu and merge-tolerant across updates. Reopening an editor waits for the stored value and mirrors the live popup instead of showing the shipped order.</w:t>
       </w:r>
     </w:p>
     <w:p>

</xml_diff>